<commit_message>
docs(cloud): registrar login Microsoft verificado
</commit_message>
<xml_diff>
--- a/docs/Nexo-Cloud-Native-Informe.docx
+++ b/docs/Nexo-Cloud-Native-Informe.docx
@@ -47,7 +47,7 @@
         <w:t xml:space="preserve">Estado del documento. </w:t>
       </w:r>
       <w:r>
-        <w:t>Registra únicamente resultados comprobados. La integración local está terminada; el acceso Microsoft real y la infraestructura AWS permanecen marcados como pendientes hasta realizar la sesión interactiva y el despliegue autorizado.</w:t>
+        <w:t>Registra únicamente resultados comprobados. La integración local y el acceso Microsoft real están verificados en Brave contra el tenant configurado. La infraestructura AWS permanece pendiente.</w:t>
       </w:r>
     </w:p>
     <w:p>
@@ -2164,7 +2164,7 @@
         <w:pStyle w:val="ListBullet"/>
       </w:pPr>
       <w:r>
-        <w:t>Habilitar el control de Brave y completar manualmente autenticación/MFA Microsoft.</w:t>
+        <w:t>Mantener evidencia del login Microsoft exitoso y logout en Brave; no se requirió cambiar Azure.</w:t>
       </w:r>
     </w:p>
     <w:p>
@@ -2172,7 +2172,7 @@
         <w:pStyle w:val="ListBullet"/>
       </w:pPr>
       <w:r>
-        <w:t>Capturar callback, logout y Network con Authorization redactado.</w:t>
+        <w:t>Capturar Network con Authorization redactado, sin mostrar el JWT completo.</w:t>
       </w:r>
     </w:p>
     <w:p>
@@ -2180,7 +2180,7 @@
         <w:pStyle w:val="ListBullet"/>
       </w:pPr>
       <w:r>
-        <w:t>Revalidar SPA, redirect URI, permisos delegados, cliente autorizado y consentimiento.</w:t>
+        <w:t>Conservar la configuración validada de SPA, redirect URI, permisos delegados y cliente autorizado.</w:t>
       </w:r>
     </w:p>
     <w:p>

</xml_diff>